<commit_message>
Nombres del equipo en propuesta, arquitectura y diagramas
</commit_message>
<xml_diff>
--- a/docs/Expediente_Vivo_Propuesta.docx
+++ b/docs/Expediente_Vivo_Propuesta.docx
@@ -7952,7 +7952,7 @@
         <w:t>AWS</w:t>
       </w:r>
       <w:r>
-        <w:t xml:space="preserve"> porque un integrante del equipo la domina (el despliegue deja de ser un riesgo), los organizadores la sugieren, y Claude está disponible en Bedrock sin cuenta aparte con Anthropic. Las tablas gold ya publicadas en BigQuery se copian a S3 como Parquet (unos 500 MB) con un comando; el pipeline no cambia.</w:t>
+        <w:t xml:space="preserve"> porque Andrés la domina (el despliegue deja de ser un riesgo), los organizadores la sugieren, y Claude está disponible en Bedrock sin cuenta aparte con Anthropic. Las tablas gold ya publicadas en BigQuery se copian a S3 como Parquet (unos 500 MB) con un comando; el pipeline no cambia.</w:t>
       </w:r>
     </w:p>
     <w:tbl>
@@ -10684,7 +10684,7 @@
                 <w:b/>
                 <w:sz w:val="17"/>
               </w:rPr>
-              <w:t>Data engineer (2 años, hoy con n8n)</w:t>
+              <w:t>Diego</w:t>
             </w:r>
           </w:p>
         </w:tc>
@@ -10701,7 +10701,7 @@
               <w:rPr>
                 <w:sz w:val="17"/>
               </w:rPr>
-              <w:t>Ingeniería de datos; n8n como herramienta habitual</w:t>
+              <w:t>Ingeniería de datos</w:t>
             </w:r>
           </w:p>
         </w:tc>
@@ -10755,7 +10755,7 @@
                 <w:b/>
                 <w:sz w:val="17"/>
               </w:rPr>
-              <w:t>Consultor de datos con AWS</w:t>
+              <w:t>Andrés</w:t>
             </w:r>
           </w:p>
         </w:tc>
@@ -10772,7 +10772,7 @@
               <w:rPr>
                 <w:sz w:val="17"/>
               </w:rPr>
-              <w:t>Infraestructura AWS</w:t>
+              <w:t>Datos e infraestructura AWS</w:t>
             </w:r>
           </w:p>
         </w:tc>
@@ -10826,7 +10826,7 @@
                 <w:b/>
                 <w:sz w:val="17"/>
               </w:rPr>
-              <w:t>Data scientist senior (10 años)</w:t>
+              <w:t>Cristhian</w:t>
             </w:r>
           </w:p>
         </w:tc>
@@ -10906,7 +10906,7 @@
           <w:i/>
           <w:sz w:val="19"/>
         </w:rPr>
-        <w:t>n8n no se usa en la solución: los jueces evalúan reproducibilidad con un solo comando y código versionado, y n8n agrega una dependencia difícil de reproducir y de auditar. Todo el flujo va en Python; n8n puede servir, como mucho, para simular el envío de notificaciones en la demo si al data engineer le resulta más rápido, y se documenta como simulación.</w:t>
+        <w:t>Todo el flujo va en Python, versionado en el repo: los jueces evalúan reproducibilidad con un solo comando. Herramientas de orquestación visual (como n8n) no se usan en la solución porque agregan una dependencia difícil de reproducir y auditar; como mucho, para simular el envío de notificaciones en la demo, documentado como simulación.</w:t>
       </w:r>
     </w:p>
     <w:p>
@@ -10915,7 +10915,7 @@
           <w:b w:val="0"/>
           <w:i w:val="0"/>
         </w:rPr>
-        <w:t>En el cronograma (sección 9) las columnas D, M, B y F corresponden a: D = data engineer, M = data scientist, B = Arturo, F = tareas de front y producto que se reparten entre Arturo y el data engineer; la columna de plataforma (P, consultor AWS) se detalla en la tabla siguiente.</w:t>
+        <w:t>En el cronograma (sección 9) las columnas D, M, B y F corresponden a: D = Diego, M = Cristhian, B = Arturo, F = tareas de front y producto que se reparten entre Arturo y Diego; la columna de plataforma (P = Andrés) se detalla en la tabla siguiente.</w:t>
       </w:r>
     </w:p>
     <w:tbl>
@@ -10965,7 +10965,7 @@
                 <w:b/>
                 <w:sz w:val="17"/>
               </w:rPr>
-              <w:t>P · Plataforma y seguridad (consultor AWS)</w:t>
+              <w:t>P · Plataforma y seguridad (Andrés)</w:t>
             </w:r>
           </w:p>
         </w:tc>
@@ -12624,7 +12624,7 @@
           <w:b w:val="0"/>
           <w:i w:val="0"/>
         </w:rPr>
-        <w:t>Roles: D = Datos y plataforma, M = ML y evaluación, B = Backend y agente, F = Producto y front. Reunión diaria de 15 minutos a las 9:00 y cierre a las 21:00 con demo interna de lo que funciona. Hitos: M1 (28 sep) flujo de punta a punta por API; M2 (1 oct) tres rutas completos en la interfaz; M3 (3 oct) evaluación y despliegue; M4 (4 oct) video y slides; entrega 5 oct.</w:t>
+        <w:t>Roles: D = Diego (datos y servicios), M = Cristhian (ML y evaluación), B = Arturo (backend y agente), F = producto y front (Arturo y Diego); P = Andrés (plataforma). Reunión diaria de 15 minutos a las 9:00 y cierre a las 21:00 con demo interna de lo que funciona. Hitos: M1 (28 sep) flujo de punta a punta por API; M2 (1 oct) tres rutas completos en la interfaz; M3 (3 oct) evaluación y despliegue; M4 (4 oct) video y slides; entrega 5 oct.</w:t>
       </w:r>
     </w:p>
     <w:tbl>
@@ -12697,7 +12697,7 @@
                 <w:b/>
                 <w:sz w:val="15"/>
               </w:rPr>
-              <w:t>D · Datos y plataforma</w:t>
+              <w:t>D · Diego</w:t>
             </w:r>
           </w:p>
         </w:tc>
@@ -12716,7 +12716,7 @@
                 <w:b/>
                 <w:sz w:val="15"/>
               </w:rPr>
-              <w:t>M · ML y evaluación</w:t>
+              <w:t>M · Cristhian</w:t>
             </w:r>
           </w:p>
         </w:tc>
@@ -12735,7 +12735,7 @@
                 <w:b/>
                 <w:sz w:val="15"/>
               </w:rPr>
-              <w:t>B · Backend y agente</w:t>
+              <w:t>B · Arturo</w:t>
             </w:r>
           </w:p>
         </w:tc>
@@ -12754,7 +12754,7 @@
                 <w:b/>
                 <w:sz w:val="15"/>
               </w:rPr>
-              <w:t>F · Producto y front</w:t>
+              <w:t>F · Front y producto</w:t>
             </w:r>
           </w:p>
         </w:tc>
@@ -13378,7 +13378,7 @@
               <w:rPr>
                 <w:sz w:val="15"/>
               </w:rPr>
-              <w:t>Pulido de las 6 conversaciones de la demo; textos en PT revisados por alguien que lo hable</w:t>
+              <w:t>Pulido de las 6 conversaciones de la demo; textos en PT generados y revisados con un LLM externo</w:t>
             </w:r>
           </w:p>
         </w:tc>
@@ -13986,7 +13986,7 @@
               <w:rPr>
                 <w:sz w:val="17"/>
               </w:rPr>
-              <w:t>Calidad del portugués sin hablantes nativos en el equipo</w:t>
+              <w:t>Calidad del portugués sin hablantes nativos en el equipo (se genera y revisa con un LLM externo)</w:t>
             </w:r>
           </w:p>
         </w:tc>
@@ -14020,7 +14020,7 @@
               <w:rPr>
                 <w:sz w:val="17"/>
               </w:rPr>
-              <w:t>Revisión por un hablante externo el día 1; se declara como limitación; métricas por idioma</w:t>
+              <w:t>Generación y revisión con un LLM externo; se declara como sintético y como limitación; métricas por idioma</w:t>
             </w:r>
           </w:p>
         </w:tc>

</xml_diff>

<commit_message>
Propuesta v1.4: cronograma desde el 28 sep, diagramas detallados apaisados, por qué espera la ruta B, score de fraude explicado
</commit_message>
<xml_diff>
--- a/docs/Expediente_Vivo_Propuesta.docx
+++ b/docs/Expediente_Vivo_Propuesta.docx
@@ -79,7 +79,7 @@
           <w:color w:val="595959"/>
           <w:sz w:val="22"/>
         </w:rPr>
-        <w:t>Versión 1.3 · 27 de septiembre de 2026 · Borrador de trabajo para el equipo</w:t>
+        <w:t>Versión 1.4 · 27 de septiembre de 2026 (18:00) · Borrador de trabajo para el equipo</w:t>
       </w:r>
     </w:p>
     <w:p>
@@ -1350,7 +1350,7 @@
         <w:t xml:space="preserve">Plazo: </w:t>
       </w:r>
       <w:r>
-        <w:t xml:space="preserve">10 días (26 de septiembre a 5 de octubre). </w:t>
+        <w:t xml:space="preserve">8 días de construcción (28 de septiembre a 5 de octubre; el 26 y 27 se usaron en análisis y diseño). </w:t>
       </w:r>
       <w:r>
         <w:rPr>
@@ -4448,6 +4448,375 @@
     </w:p>
     <w:p>
       <w:pPr>
+        <w:spacing w:after="40"/>
+      </w:pPr>
+      <w:r>
+        <w:rPr>
+          <w:b w:val="0"/>
+          <w:i w:val="0"/>
+        </w:rPr>
+        <w:t>Por qué la ruta B no se resuelve al momento: el chat hace todo lo que se puede hacer en la conversación (encontrar el cargo, verificar que es del cliente, registrar la evidencia, abrir el caso, dar número y fecha). Lo que no puede hacer es resolver el fondo, porque exige investigar o decidir sobre dinero, y ninguna de las dos cosas debe hacerlas un chat solo:</w:t>
+      </w:r>
+    </w:p>
+    <w:tbl>
+      <w:tblPr>
+        <w:tblStyle w:val="TableGrid"/>
+        <w:tblW w:type="auto" w:w="0"/>
+        <w:jc w:val="center"/>
+        <w:tblLayout w:type="fixed"/>
+        <w:tblLook w:firstColumn="1" w:firstRow="1" w:lastColumn="0" w:lastRow="0" w:noHBand="0" w:noVBand="1" w:val="04A0"/>
+      </w:tblPr>
+      <w:tblGrid>
+        <w:gridCol w:w="3137"/>
+        <w:gridCol w:w="3137"/>
+        <w:gridCol w:w="3137"/>
+      </w:tblGrid>
+      <w:tr>
+        <w:tc>
+          <w:tcPr>
+            <w:tcW w:type="dxa" w:w="1928"/>
+            <w:shd w:val="clear" w:color="auto" w:fill="D9E2F3"/>
+          </w:tcPr>
+          <w:p>
+            <w:pPr>
+              <w:spacing w:after="20"/>
+            </w:pPr>
+            <w:r/>
+            <w:r>
+              <w:rPr>
+                <w:b/>
+                <w:sz w:val="17"/>
+              </w:rPr>
+              <w:t>Tipo de queja</w:t>
+            </w:r>
+          </w:p>
+        </w:tc>
+        <w:tc>
+          <w:tcPr>
+            <w:tcW w:type="dxa" w:w="3288"/>
+            <w:shd w:val="clear" w:color="auto" w:fill="D9E2F3"/>
+          </w:tcPr>
+          <w:p>
+            <w:pPr>
+              <w:spacing w:after="20"/>
+            </w:pPr>
+            <w:r/>
+            <w:r>
+              <w:rPr>
+                <w:b/>
+                <w:sz w:val="17"/>
+              </w:rPr>
+              <w:t>Se hace al momento (chat)</w:t>
+            </w:r>
+          </w:p>
+        </w:tc>
+        <w:tc>
+          <w:tcPr>
+            <w:tcW w:type="dxa" w:w="4139"/>
+            <w:shd w:val="clear" w:color="auto" w:fill="D9E2F3"/>
+          </w:tcPr>
+          <w:p>
+            <w:pPr>
+              <w:spacing w:after="20"/>
+            </w:pPr>
+            <w:r/>
+            <w:r>
+              <w:rPr>
+                <w:b/>
+                <w:sz w:val="17"/>
+              </w:rPr>
+              <w:t>No se puede al momento, y por qué</w:t>
+            </w:r>
+          </w:p>
+        </w:tc>
+      </w:tr>
+      <w:tr>
+        <w:tc>
+          <w:tcPr>
+            <w:tcW w:type="dxa" w:w="1928"/>
+          </w:tcPr>
+          <w:p>
+            <w:pPr>
+              <w:spacing w:after="20"/>
+            </w:pPr>
+            <w:r/>
+            <w:r>
+              <w:rPr>
+                <w:b/>
+                <w:sz w:val="17"/>
+              </w:rPr>
+              <w:t>Cargo no reconocido</w:t>
+            </w:r>
+          </w:p>
+        </w:tc>
+        <w:tc>
+          <w:tcPr>
+            <w:tcW w:type="dxa" w:w="3288"/>
+          </w:tcPr>
+          <w:p>
+            <w:pPr>
+              <w:spacing w:after="20"/>
+            </w:pPr>
+            <w:r/>
+            <w:r>
+              <w:rPr>
+                <w:sz w:val="17"/>
+              </w:rPr>
+              <w:t>Mostrar el cargo, bloquear la tarjeta con confirmación, abrir el caso</w:t>
+            </w:r>
+          </w:p>
+        </w:tc>
+        <w:tc>
+          <w:tcPr>
+            <w:tcW w:type="dxa" w:w="4139"/>
+          </w:tcPr>
+          <w:p>
+            <w:pPr>
+              <w:spacing w:after="20"/>
+            </w:pPr>
+            <w:r/>
+            <w:r>
+              <w:rPr>
+                <w:sz w:val="17"/>
+              </w:rPr>
+              <w:t>Devolver el dinero: es un contracargo que pasa por la red de tarjetas y el comercio (días); el brief prohíbe mover dinero</w:t>
+            </w:r>
+          </w:p>
+        </w:tc>
+      </w:tr>
+      <w:tr>
+        <w:tc>
+          <w:tcPr>
+            <w:tcW w:type="dxa" w:w="1928"/>
+          </w:tcPr>
+          <w:p>
+            <w:pPr>
+              <w:spacing w:after="20"/>
+            </w:pPr>
+            <w:r/>
+            <w:r>
+              <w:rPr>
+                <w:b/>
+                <w:sz w:val="17"/>
+              </w:rPr>
+              <w:t>Cobro indebido</w:t>
+            </w:r>
+          </w:p>
+        </w:tc>
+        <w:tc>
+          <w:tcPr>
+            <w:tcW w:type="dxa" w:w="3288"/>
+          </w:tcPr>
+          <w:p>
+            <w:pPr>
+              <w:spacing w:after="20"/>
+            </w:pPr>
+            <w:r/>
+            <w:r>
+              <w:rPr>
+                <w:sz w:val="17"/>
+              </w:rPr>
+              <w:t>Comparar con la tarifa; si coincide, explicar y cerrar (ruta A)</w:t>
+            </w:r>
+          </w:p>
+        </w:tc>
+        <w:tc>
+          <w:tcPr>
+            <w:tcW w:type="dxa" w:w="4139"/>
+          </w:tcPr>
+          <w:p>
+            <w:pPr>
+              <w:spacing w:after="20"/>
+            </w:pPr>
+            <w:r/>
+            <w:r>
+              <w:rPr>
+                <w:sz w:val="17"/>
+              </w:rPr>
+              <w:t>Anular la comisión: requiere una persona autorizada que la revierta en el core</w:t>
+            </w:r>
+          </w:p>
+        </w:tc>
+      </w:tr>
+      <w:tr>
+        <w:tc>
+          <w:tcPr>
+            <w:tcW w:type="dxa" w:w="1928"/>
+          </w:tcPr>
+          <w:p>
+            <w:pPr>
+              <w:spacing w:after="20"/>
+            </w:pPr>
+            <w:r/>
+            <w:r>
+              <w:rPr>
+                <w:b/>
+                <w:sz w:val="17"/>
+              </w:rPr>
+              <w:t>Problema con app</w:t>
+            </w:r>
+          </w:p>
+        </w:tc>
+        <w:tc>
+          <w:tcPr>
+            <w:tcW w:type="dxa" w:w="3288"/>
+          </w:tcPr>
+          <w:p>
+            <w:pPr>
+              <w:spacing w:after="20"/>
+            </w:pPr>
+            <w:r/>
+            <w:r>
+              <w:rPr>
+                <w:sz w:val="17"/>
+              </w:rPr>
+              <w:t>Guía; registrar el error y el dinero afectado</w:t>
+            </w:r>
+          </w:p>
+        </w:tc>
+        <w:tc>
+          <w:tcPr>
+            <w:tcW w:type="dxa" w:w="4139"/>
+          </w:tcPr>
+          <w:p>
+            <w:pPr>
+              <w:spacing w:after="20"/>
+            </w:pPr>
+            <w:r/>
+            <w:r>
+              <w:rPr>
+                <w:sz w:val="17"/>
+              </w:rPr>
+              <w:t>Corregir el error o recuperar el dinero: lo hace el equipo técnico</w:t>
+            </w:r>
+          </w:p>
+        </w:tc>
+      </w:tr>
+      <w:tr>
+        <w:tc>
+          <w:tcPr>
+            <w:tcW w:type="dxa" w:w="1928"/>
+          </w:tcPr>
+          <w:p>
+            <w:pPr>
+              <w:spacing w:after="20"/>
+            </w:pPr>
+            <w:r/>
+            <w:r>
+              <w:rPr>
+                <w:b/>
+                <w:sz w:val="17"/>
+              </w:rPr>
+              <w:t>Atención en sucursal</w:t>
+            </w:r>
+          </w:p>
+        </w:tc>
+        <w:tc>
+          <w:tcPr>
+            <w:tcW w:type="dxa" w:w="3288"/>
+          </w:tcPr>
+          <w:p>
+            <w:pPr>
+              <w:spacing w:after="20"/>
+            </w:pPr>
+            <w:r/>
+            <w:r>
+              <w:rPr>
+                <w:sz w:val="17"/>
+              </w:rPr>
+              <w:t>Registrar sucursal, fecha y hecho</w:t>
+            </w:r>
+          </w:p>
+        </w:tc>
+        <w:tc>
+          <w:tcPr>
+            <w:tcW w:type="dxa" w:w="4139"/>
+          </w:tcPr>
+          <w:p>
+            <w:pPr>
+              <w:spacing w:after="20"/>
+            </w:pPr>
+            <w:r/>
+            <w:r>
+              <w:rPr>
+                <w:sz w:val="17"/>
+              </w:rPr>
+              <w:t>Investigar con la sucursal y las personas involucradas</w:t>
+            </w:r>
+          </w:p>
+        </w:tc>
+      </w:tr>
+      <w:tr>
+        <w:tc>
+          <w:tcPr>
+            <w:tcW w:type="dxa" w:w="1928"/>
+          </w:tcPr>
+          <w:p>
+            <w:pPr>
+              <w:spacing w:after="20"/>
+            </w:pPr>
+            <w:r/>
+            <w:r>
+              <w:rPr>
+                <w:b/>
+                <w:sz w:val="17"/>
+              </w:rPr>
+              <w:t>Calidad de servicio</w:t>
+            </w:r>
+          </w:p>
+        </w:tc>
+        <w:tc>
+          <w:tcPr>
+            <w:tcW w:type="dxa" w:w="3288"/>
+          </w:tcPr>
+          <w:p>
+            <w:pPr>
+              <w:spacing w:after="20"/>
+            </w:pPr>
+            <w:r/>
+            <w:r>
+              <w:rPr>
+                <w:sz w:val="17"/>
+              </w:rPr>
+              <w:t>Registrar canal, fecha y contacto previo</w:t>
+            </w:r>
+          </w:p>
+        </w:tc>
+        <w:tc>
+          <w:tcPr>
+            <w:tcW w:type="dxa" w:w="4139"/>
+          </w:tcPr>
+          <w:p>
+            <w:pPr>
+              <w:spacing w:after="20"/>
+            </w:pPr>
+            <w:r/>
+            <w:r>
+              <w:rPr>
+                <w:sz w:val="17"/>
+              </w:rPr>
+              <w:t>Revisar la atención: grabación, agente</w:t>
+            </w:r>
+          </w:p>
+        </w:tc>
+      </w:tr>
+    </w:tbl>
+    <w:p>
+      <w:pPr>
+        <w:spacing w:after="40"/>
+      </w:pPr>
+    </w:p>
+    <w:p>
+      <w:r>
+        <w:rPr>
+          <w:b w:val="0"/>
+          <w:i w:val="0"/>
+        </w:rPr>
+        <w:t>Lo que cambia respecto de hoy: la primera respuesta pasa de 38 horas a segundos, el caso nace completo (hoy el 67% no trae monto y el 100% referencia un producto ajeno, que es lo que alarga los 16 días), el reloj garantiza que alguien lo tome en 24 horas, y la fecha prometida es realista.</w:t>
+      </w:r>
+    </w:p>
+    <w:p>
+      <w:pPr>
         <w:pStyle w:val="Heading2"/>
       </w:pPr>
       <w:r>
@@ -5282,6 +5651,269 @@
     </w:p>
     <w:p>
       <w:pPr>
+        <w:pStyle w:val="Heading2"/>
+      </w:pPr>
+      <w:r>
+        <w:t>3.7 Qué es el score de fraude y por qué la regla es ‘score &gt; 30’</w:t>
+      </w:r>
+    </w:p>
+    <w:p>
+      <w:r>
+        <w:rPr>
+          <w:b w:val="0"/>
+          <w:i w:val="0"/>
+        </w:rPr>
+        <w:t>Cada transacción trae dos columnas: is_fraud (la verdad: si fue fraude, que en un banco real se sabe después) y fraud_score, una calificación de sospecha de 0 a 100 que el sistema antifraude calculó en el momento. En la data, las transacciones legítimas tienen score entre 0 y 30 y las fraudulentas entre 0 y 100; por eso todo lo que supera 30 es fraude con certeza:</w:t>
+      </w:r>
+    </w:p>
+    <w:tbl>
+      <w:tblPr>
+        <w:tblStyle w:val="TableGrid"/>
+        <w:tblW w:type="auto" w:w="0"/>
+        <w:jc w:val="center"/>
+        <w:tblLayout w:type="fixed"/>
+        <w:tblLook w:firstColumn="1" w:firstRow="1" w:lastColumn="0" w:lastRow="0" w:noHBand="0" w:noVBand="1" w:val="04A0"/>
+      </w:tblPr>
+      <w:tblGrid>
+        <w:gridCol w:w="3137"/>
+        <w:gridCol w:w="3137"/>
+        <w:gridCol w:w="3137"/>
+      </w:tblGrid>
+      <w:tr>
+        <w:tc>
+          <w:tcPr>
+            <w:tcW w:type="dxa" w:w="2835"/>
+            <w:shd w:val="clear" w:color="auto" w:fill="D9E2F3"/>
+          </w:tcPr>
+          <w:p>
+            <w:pPr>
+              <w:spacing w:after="20"/>
+            </w:pPr>
+            <w:r/>
+            <w:r>
+              <w:rPr>
+                <w:b/>
+                <w:sz w:val="18"/>
+              </w:rPr>
+              <w:t>Score de la transacción</w:t>
+            </w:r>
+          </w:p>
+        </w:tc>
+        <w:tc>
+          <w:tcPr>
+            <w:tcW w:type="dxa" w:w="2268"/>
+            <w:shd w:val="clear" w:color="auto" w:fill="D9E2F3"/>
+          </w:tcPr>
+          <w:p>
+            <w:pPr>
+              <w:spacing w:after="20"/>
+            </w:pPr>
+            <w:r/>
+            <w:r>
+              <w:rPr>
+                <w:b/>
+                <w:sz w:val="18"/>
+              </w:rPr>
+              <w:t>Transacciones</w:t>
+            </w:r>
+          </w:p>
+        </w:tc>
+        <w:tc>
+          <w:tcPr>
+            <w:tcW w:type="dxa" w:w="2268"/>
+            <w:shd w:val="clear" w:color="auto" w:fill="D9E2F3"/>
+          </w:tcPr>
+          <w:p>
+            <w:pPr>
+              <w:spacing w:after="20"/>
+            </w:pPr>
+            <w:r/>
+            <w:r>
+              <w:rPr>
+                <w:b/>
+                <w:sz w:val="18"/>
+              </w:rPr>
+              <w:t>Fraudes reales</w:t>
+            </w:r>
+          </w:p>
+        </w:tc>
+      </w:tr>
+      <w:tr>
+        <w:tc>
+          <w:tcPr>
+            <w:tcW w:type="dxa" w:w="2835"/>
+          </w:tcPr>
+          <w:p>
+            <w:pPr>
+              <w:spacing w:after="20"/>
+            </w:pPr>
+            <w:r/>
+            <w:r>
+              <w:rPr>
+                <w:sz w:val="18"/>
+              </w:rPr>
+              <w:t>Nulo (sin score)</w:t>
+            </w:r>
+          </w:p>
+        </w:tc>
+        <w:tc>
+          <w:tcPr>
+            <w:tcW w:type="dxa" w:w="2268"/>
+          </w:tcPr>
+          <w:p>
+            <w:pPr>
+              <w:spacing w:after="20"/>
+            </w:pPr>
+            <w:r/>
+            <w:r>
+              <w:rPr>
+                <w:sz w:val="18"/>
+              </w:rPr>
+              <w:t>885.157</w:t>
+            </w:r>
+          </w:p>
+        </w:tc>
+        <w:tc>
+          <w:tcPr>
+            <w:tcW w:type="dxa" w:w="2268"/>
+          </w:tcPr>
+          <w:p>
+            <w:pPr>
+              <w:spacing w:after="20"/>
+            </w:pPr>
+            <w:r/>
+            <w:r>
+              <w:rPr>
+                <w:sz w:val="18"/>
+              </w:rPr>
+              <w:t>891 (0,1%)</w:t>
+            </w:r>
+          </w:p>
+        </w:tc>
+      </w:tr>
+      <w:tr>
+        <w:tc>
+          <w:tcPr>
+            <w:tcW w:type="dxa" w:w="2835"/>
+          </w:tcPr>
+          <w:p>
+            <w:pPr>
+              <w:spacing w:after="20"/>
+            </w:pPr>
+            <w:r/>
+            <w:r>
+              <w:rPr>
+                <w:sz w:val="18"/>
+              </w:rPr>
+              <w:t>Entre 0 y 30</w:t>
+            </w:r>
+          </w:p>
+        </w:tc>
+        <w:tc>
+          <w:tcPr>
+            <w:tcW w:type="dxa" w:w="2268"/>
+          </w:tcPr>
+          <w:p>
+            <w:pPr>
+              <w:spacing w:after="20"/>
+            </w:pPr>
+            <w:r/>
+            <w:r>
+              <w:rPr>
+                <w:sz w:val="18"/>
+              </w:rPr>
+              <w:t>3.537.478</w:t>
+            </w:r>
+          </w:p>
+        </w:tc>
+        <w:tc>
+          <w:tcPr>
+            <w:tcW w:type="dxa" w:w="2268"/>
+          </w:tcPr>
+          <w:p>
+            <w:pPr>
+              <w:spacing w:after="20"/>
+            </w:pPr>
+            <w:r/>
+            <w:r>
+              <w:rPr>
+                <w:sz w:val="18"/>
+              </w:rPr>
+              <w:t>1.052 (0,03%)</w:t>
+            </w:r>
+          </w:p>
+        </w:tc>
+      </w:tr>
+      <w:tr>
+        <w:tc>
+          <w:tcPr>
+            <w:tcW w:type="dxa" w:w="2835"/>
+          </w:tcPr>
+          <w:p>
+            <w:pPr>
+              <w:spacing w:after="20"/>
+            </w:pPr>
+            <w:r/>
+            <w:r>
+              <w:rPr>
+                <w:sz w:val="18"/>
+              </w:rPr>
+              <w:t>Mayor que 30</w:t>
+            </w:r>
+          </w:p>
+        </w:tc>
+        <w:tc>
+          <w:tcPr>
+            <w:tcW w:type="dxa" w:w="2268"/>
+          </w:tcPr>
+          <w:p>
+            <w:pPr>
+              <w:spacing w:after="20"/>
+            </w:pPr>
+            <w:r/>
+            <w:r>
+              <w:rPr>
+                <w:sz w:val="18"/>
+              </w:rPr>
+              <w:t>2.373</w:t>
+            </w:r>
+          </w:p>
+        </w:tc>
+        <w:tc>
+          <w:tcPr>
+            <w:tcW w:type="dxa" w:w="2268"/>
+          </w:tcPr>
+          <w:p>
+            <w:pPr>
+              <w:spacing w:after="20"/>
+            </w:pPr>
+            <w:r/>
+            <w:r>
+              <w:rPr>
+                <w:sz w:val="18"/>
+              </w:rPr>
+              <w:t>2.373 (100%)</w:t>
+            </w:r>
+          </w:p>
+        </w:tc>
+      </w:tr>
+    </w:tbl>
+    <w:p>
+      <w:pPr>
+        <w:spacing w:after="40"/>
+      </w:pPr>
+    </w:p>
+    <w:p>
+      <w:r>
+        <w:rPr>
+          <w:b w:val="0"/>
+          <w:i w:val="0"/>
+        </w:rPr>
+        <w:t>Precisión 100%: de lo que la regla marca, todo es fraude (cero falsas alarmas). Cobertura 55%: de los 4.316 fraudes reales, la regla atrapa 2.373; los otros 1.943 no se distinguen de una compra normal con ninguna variable (se probaron 44). El banco aprobó el 92% de los fraudes pese al score: nadie actuaba sobre él. La vía rápida usa la regla como disparador determinista y siempre pide confirmación al cliente, porque en un banco real los scores se solapan y habría falsas alarmas; la perfección del corte es un artefacto del dataset sintético y se declara.</w:t>
+      </w:r>
+    </w:p>
+    <w:p>
+      <w:pPr>
         <w:pStyle w:val="Heading1"/>
       </w:pPr>
       <w:r>
@@ -6946,6 +7578,27 @@
           <w:sz w:val="19"/>
         </w:rPr>
         <w:t>El chat nunca desbloquea tarjetas, nunca promete reembolsos ni compensaciones y nunca mueve dinero. Bloquear una tarjeta requiere confirmación explícita del cliente y verificación del resultado en el core simulado.</w:t>
+      </w:r>
+    </w:p>
+    <w:p>
+      <w:pPr>
+        <w:shd w:val="clear" w:color="auto" w:fill="F2F2F2"/>
+        <w:spacing w:after="160"/>
+        <w:ind w:left="170"/>
+      </w:pPr>
+      <w:r>
+        <w:rPr>
+          <w:b/>
+          <w:sz w:val="19"/>
+        </w:rPr>
+        <w:t xml:space="preserve">Dos plazos distintos: </w:t>
+      </w:r>
+      <w:r>
+        <w:rPr>
+          <w:i/>
+          <w:sz w:val="19"/>
+        </w:rPr>
+        <w:t>La columna ‘Prioridad / SLA interno’ es el tiempo máximo para que una persona TOME el caso (2 h fraude, 4 h regulador, 8 h reincidente), no el tiempo de resolución. El cliente recibe respuesta, número de caso y quién lo atenderá en segundos; la resolución de fondo sigue los plazos de la ruta B (mediana 16 días; el 90% en 28 o menos).</w:t>
       </w:r>
     </w:p>
     <w:p>
@@ -7934,6 +8587,136 @@
     </w:p>
     <w:p>
       <w:pPr>
+        <w:sectPr>
+          <w:footerReference w:type="default" r:id="rId9"/>
+          <w:pgSz w:w="11906" w:h="16838"/>
+          <w:pgMar w:top="1134" w:right="1247" w:bottom="1134" w:left="1247" w:header="720" w:footer="720" w:gutter="0"/>
+          <w:cols w:space="720"/>
+          <w:docGrid w:linePitch="360"/>
+        </w:sectPr>
+      </w:pPr>
+    </w:p>
+    <w:p>
+      <w:pPr>
+        <w:spacing w:after="40"/>
+      </w:pPr>
+      <w:r>
+        <w:rPr>
+          <w:b w:val="0"/>
+          <w:i w:val="0"/>
+          <w:sz w:val="19"/>
+        </w:rPr>
+        <w:t>Arquitectura detallada: los números siguen el camino de una queja (1 el cliente escribe, 2 sesión y perfil, 3 el clasificador, 4 el LLM extrae o pregunta, 5 el gateway verifica, 6 las reglas eligen la ruta, 7 se actúa y verifica, 8 promesa y reloj, 9 el reloj avisa, 10 el humano recibe el expediente).</w:t>
+      </w:r>
+    </w:p>
+    <w:p>
+      <w:pPr>
+        <w:jc w:val="center"/>
+      </w:pPr>
+      <w:r>
+        <w:drawing>
+          <wp:inline xmlns:a="http://schemas.openxmlformats.org/drawingml/2006/main" xmlns:pic="http://schemas.openxmlformats.org/drawingml/2006/picture">
+            <wp:extent cx="8640000" cy="5990920"/>
+            <wp:docPr id="2" name="Picture 2"/>
+            <wp:cNvGraphicFramePr>
+              <a:graphicFrameLocks noChangeAspect="1"/>
+            </wp:cNvGraphicFramePr>
+            <a:graphic>
+              <a:graphicData uri="http://schemas.openxmlformats.org/drawingml/2006/picture">
+                <pic:pic>
+                  <pic:nvPicPr>
+                    <pic:cNvPr id="0" name="arquitectura_detallada.png"/>
+                    <pic:cNvPicPr/>
+                  </pic:nvPicPr>
+                  <pic:blipFill>
+                    <a:blip r:embed="rId11"/>
+                    <a:stretch>
+                      <a:fillRect/>
+                    </a:stretch>
+                  </pic:blipFill>
+                  <pic:spPr>
+                    <a:xfrm>
+                      <a:off x="0" y="0"/>
+                      <a:ext cx="8640000" cy="5990920"/>
+                    </a:xfrm>
+                    <a:prstGeom prst="rect"/>
+                  </pic:spPr>
+                </pic:pic>
+              </a:graphicData>
+            </a:graphic>
+          </wp:inline>
+        </w:drawing>
+      </w:r>
+    </w:p>
+    <w:p>
+      <w:r>
+        <w:br w:type="page"/>
+      </w:r>
+    </w:p>
+    <w:p>
+      <w:pPr>
+        <w:spacing w:after="40"/>
+      </w:pPr>
+      <w:r>
+        <w:rPr>
+          <w:b w:val="0"/>
+          <w:i w:val="0"/>
+          <w:sz w:val="19"/>
+        </w:rPr>
+        <w:t>Flujo de una conversación, turno a turno (morado = regla en código, coral = modelo, verde = humano, gris = automático con datos).</w:t>
+      </w:r>
+    </w:p>
+    <w:p>
+      <w:pPr>
+        <w:jc w:val="center"/>
+      </w:pPr>
+      <w:r>
+        <w:drawing>
+          <wp:inline xmlns:a="http://schemas.openxmlformats.org/drawingml/2006/main" xmlns:pic="http://schemas.openxmlformats.org/drawingml/2006/picture">
+            <wp:extent cx="8640000" cy="5817730"/>
+            <wp:docPr id="3" name="Picture 3"/>
+            <wp:cNvGraphicFramePr>
+              <a:graphicFrameLocks noChangeAspect="1"/>
+            </wp:cNvGraphicFramePr>
+            <a:graphic>
+              <a:graphicData uri="http://schemas.openxmlformats.org/drawingml/2006/picture">
+                <pic:pic>
+                  <pic:nvPicPr>
+                    <pic:cNvPr id="0" name="flujo_conversacion.png"/>
+                    <pic:cNvPicPr/>
+                  </pic:nvPicPr>
+                  <pic:blipFill>
+                    <a:blip r:embed="rId12"/>
+                    <a:stretch>
+                      <a:fillRect/>
+                    </a:stretch>
+                  </pic:blipFill>
+                  <pic:spPr>
+                    <a:xfrm>
+                      <a:off x="0" y="0"/>
+                      <a:ext cx="8640000" cy="5817730"/>
+                    </a:xfrm>
+                    <a:prstGeom prst="rect"/>
+                  </pic:spPr>
+                </pic:pic>
+              </a:graphicData>
+            </a:graphic>
+          </wp:inline>
+        </w:drawing>
+      </w:r>
+    </w:p>
+    <w:p>
+      <w:pPr>
+        <w:sectPr>
+          <w:pgSz w:w="16838" w:h="11906" w:orient="landscape"/>
+          <w:pgMar w:top="850" w:right="850" w:bottom="850" w:left="850" w:header="720" w:footer="720" w:gutter="0"/>
+          <w:cols w:space="720"/>
+          <w:docGrid w:linePitch="360"/>
+        </w:sectPr>
+      </w:pPr>
+    </w:p>
+    <w:p>
+      <w:pPr>
         <w:pStyle w:val="Heading2"/>
       </w:pPr>
       <w:r>
@@ -7964,10 +8747,10 @@
         <w:tblLook w:firstColumn="1" w:firstRow="1" w:lastColumn="0" w:lastRow="0" w:noHBand="0" w:noVBand="1" w:val="04A0"/>
       </w:tblPr>
       <w:tblGrid>
-        <w:gridCol w:w="2353"/>
-        <w:gridCol w:w="2353"/>
-        <w:gridCol w:w="2353"/>
-        <w:gridCol w:w="2353"/>
+        <w:gridCol w:w="2551"/>
+        <w:gridCol w:w="2551"/>
+        <w:gridCol w:w="2551"/>
+        <w:gridCol w:w="2551"/>
       </w:tblGrid>
       <w:tr>
         <w:tc>
@@ -8621,9 +9404,9 @@
         <w:tblLook w:firstColumn="1" w:firstRow="1" w:lastColumn="0" w:lastRow="0" w:noHBand="0" w:noVBand="1" w:val="04A0"/>
       </w:tblPr>
       <w:tblGrid>
-        <w:gridCol w:w="3137"/>
-        <w:gridCol w:w="3137"/>
-        <w:gridCol w:w="3137"/>
+        <w:gridCol w:w="3402"/>
+        <w:gridCol w:w="3402"/>
+        <w:gridCol w:w="3402"/>
       </w:tblGrid>
       <w:tr>
         <w:tc>
@@ -9061,10 +9844,10 @@
         <w:tblLook w:firstColumn="1" w:firstRow="1" w:lastColumn="0" w:lastRow="0" w:noHBand="0" w:noVBand="1" w:val="04A0"/>
       </w:tblPr>
       <w:tblGrid>
-        <w:gridCol w:w="2353"/>
-        <w:gridCol w:w="2353"/>
-        <w:gridCol w:w="2353"/>
-        <w:gridCol w:w="2353"/>
+        <w:gridCol w:w="2551"/>
+        <w:gridCol w:w="2551"/>
+        <w:gridCol w:w="2551"/>
+        <w:gridCol w:w="2551"/>
       </w:tblGrid>
       <w:tr>
         <w:tc>
@@ -9539,8 +10322,8 @@
         <w:tblLook w:firstColumn="1" w:firstRow="1" w:lastColumn="0" w:lastRow="0" w:noHBand="0" w:noVBand="1" w:val="04A0"/>
       </w:tblPr>
       <w:tblGrid>
-        <w:gridCol w:w="4706"/>
-        <w:gridCol w:w="4706"/>
+        <w:gridCol w:w="5103"/>
+        <w:gridCol w:w="5103"/>
       </w:tblGrid>
       <w:tr>
         <w:tc>
@@ -9827,10 +10610,10 @@
         <w:tblLook w:firstColumn="1" w:firstRow="1" w:lastColumn="0" w:lastRow="0" w:noHBand="0" w:noVBand="1" w:val="04A0"/>
       </w:tblPr>
       <w:tblGrid>
-        <w:gridCol w:w="2353"/>
-        <w:gridCol w:w="2353"/>
-        <w:gridCol w:w="2353"/>
-        <w:gridCol w:w="2353"/>
+        <w:gridCol w:w="2551"/>
+        <w:gridCol w:w="2551"/>
+        <w:gridCol w:w="2551"/>
+        <w:gridCol w:w="2551"/>
       </w:tblGrid>
       <w:tr>
         <w:tc>
@@ -10515,10 +11298,10 @@
         <w:tblLook w:firstColumn="1" w:firstRow="1" w:lastColumn="0" w:lastRow="0" w:noHBand="0" w:noVBand="1" w:val="04A0"/>
       </w:tblPr>
       <w:tblGrid>
-        <w:gridCol w:w="2353"/>
-        <w:gridCol w:w="2353"/>
-        <w:gridCol w:w="2353"/>
-        <w:gridCol w:w="2353"/>
+        <w:gridCol w:w="2551"/>
+        <w:gridCol w:w="2551"/>
+        <w:gridCol w:w="2551"/>
+        <w:gridCol w:w="2551"/>
       </w:tblGrid>
       <w:tr>
         <w:tc>
@@ -10927,8 +11710,8 @@
         <w:tblLook w:firstColumn="1" w:firstRow="1" w:lastColumn="0" w:lastRow="0" w:noHBand="0" w:noVBand="1" w:val="04A0"/>
       </w:tblPr>
       <w:tblGrid>
-        <w:gridCol w:w="4706"/>
-        <w:gridCol w:w="4706"/>
+        <w:gridCol w:w="5103"/>
+        <w:gridCol w:w="5103"/>
       </w:tblGrid>
       <w:tr>
         <w:tc>
@@ -10985,7 +11768,7 @@
                 <w:b/>
                 <w:sz w:val="17"/>
               </w:rPr>
-              <w:t>Sáb 26 – Dom 27 sep</w:t>
+              <w:t>Dom 27 sep (noche) – Lun 28 sep</w:t>
             </w:r>
           </w:p>
         </w:tc>
@@ -11002,7 +11785,7 @@
               <w:rPr>
                 <w:sz w:val="17"/>
               </w:rPr>
-              <w:t>Cuenta AWS lista: verificar que Bedrock esté disponible en la cuenta gratuita y habilitar acceso a Claude Opus 5 y Sonnet 5 en us-east-2; IAM mínimo; alarma de presupuesto (30 USD); bucket S3 para gold y trazas; tabla DynamoDB</w:t>
+              <w:t>Cuenta AWS lista: verificar que Bedrock esté disponible en la cuenta gratuita y habilitar Claude Opus 5 y Sonnet 5 en us-east-2 (si no: API directa de Anthropic); IAM mínimo; alarma de presupuesto (30 USD); bucket S3 para gold y trazas; tabla DynamoDB</w:t>
             </w:r>
           </w:p>
         </w:tc>
@@ -11022,7 +11805,7 @@
                 <w:b/>
                 <w:sz w:val="17"/>
               </w:rPr>
-              <w:t>Lun 28 sep</w:t>
+              <w:t>Mar 29 sep</w:t>
             </w:r>
           </w:p>
         </w:tc>
@@ -11039,7 +11822,7 @@
               <w:rPr>
                 <w:sz w:val="17"/>
               </w:rPr>
-              <w:t>Despliegue de prueba del contenedor (App Runner; si no está disponible en la cuenta gratuita, Lambda + API Gateway); Secrets Manager; primera prueba de Bedrock desde la API</w:t>
+              <w:t>Despliegue de prueba del contenedor (App Runner; si no está disponible, Lambda + API Gateway); Secrets Manager; primera consulta a Bedrock desde la API</w:t>
             </w:r>
           </w:p>
         </w:tc>
@@ -11059,7 +11842,7 @@
                 <w:b/>
                 <w:sz w:val="17"/>
               </w:rPr>
-              <w:t>Mar 29 – Mié 30 sep</w:t>
+              <w:t>Mié 30 sep – Jue 1 oct</w:t>
             </w:r>
           </w:p>
         </w:tc>
@@ -11096,7 +11879,7 @@
                 <w:b/>
                 <w:sz w:val="17"/>
               </w:rPr>
-              <w:t>Jue 1 – Vie 2 oct</w:t>
+              <w:t>Vie 2 oct</w:t>
             </w:r>
           </w:p>
         </w:tc>
@@ -11187,11 +11970,11 @@
         <w:tblLook w:firstColumn="1" w:firstRow="1" w:lastColumn="0" w:lastRow="0" w:noHBand="0" w:noVBand="1" w:val="04A0"/>
       </w:tblPr>
       <w:tblGrid>
-        <w:gridCol w:w="1882"/>
-        <w:gridCol w:w="1882"/>
-        <w:gridCol w:w="1882"/>
-        <w:gridCol w:w="1882"/>
-        <w:gridCol w:w="1882"/>
+        <w:gridCol w:w="2041"/>
+        <w:gridCol w:w="2041"/>
+        <w:gridCol w:w="2041"/>
+        <w:gridCol w:w="2041"/>
+        <w:gridCol w:w="2041"/>
       </w:tblGrid>
       <w:tr>
         <w:tc>
@@ -11789,9 +12572,9 @@
         <w:tblLook w:firstColumn="1" w:firstRow="1" w:lastColumn="0" w:lastRow="0" w:noHBand="0" w:noVBand="1" w:val="04A0"/>
       </w:tblPr>
       <w:tblGrid>
-        <w:gridCol w:w="3137"/>
-        <w:gridCol w:w="3137"/>
-        <w:gridCol w:w="3137"/>
+        <w:gridCol w:w="3402"/>
+        <w:gridCol w:w="3402"/>
+        <w:gridCol w:w="3402"/>
       </w:tblGrid>
       <w:tr>
         <w:tc>
@@ -12260,8 +13043,8 @@
         <w:tblLook w:firstColumn="1" w:firstRow="1" w:lastColumn="0" w:lastRow="0" w:noHBand="0" w:noVBand="1" w:val="04A0"/>
       </w:tblPr>
       <w:tblGrid>
-        <w:gridCol w:w="4706"/>
-        <w:gridCol w:w="4706"/>
+        <w:gridCol w:w="5103"/>
+        <w:gridCol w:w="5103"/>
       </w:tblGrid>
       <w:tr>
         <w:tc>
@@ -12615,7 +13398,7 @@
         <w:pStyle w:val="Heading1"/>
       </w:pPr>
       <w:r>
-        <w:t>9. Cronograma día por día (26 de septiembre a 5 de octubre)</w:t>
+        <w:t>9. Cronograma día por día (28 de septiembre a 5 de octubre)</w:t>
       </w:r>
     </w:p>
     <w:p>
@@ -12624,7 +13407,7 @@
           <w:b w:val="0"/>
           <w:i w:val="0"/>
         </w:rPr>
-        <w:t>Roles: D = Diego (datos y servicios), M = Cristhian (ML y evaluación), B = Arturo (backend y agente), F = producto y front (Arturo y Diego); P = Andrés (plataforma). Reunión diaria de 15 minutos a las 9:00 y cierre a las 21:00 con demo interna de lo que funciona. Hitos: M1 (28 sep) flujo de punta a punta por API; M2 (1 oct) tres rutas completos en la interfaz; M3 (3 oct) evaluación y despliegue; M4 (4 oct) video y slides; entrega 5 oct.</w:t>
+        <w:t>Situación al 27 de septiembre, 18:00: el análisis de datos, el pipeline, la elección del flujo y la arquitectura están hechos; la reunión de esta noche valida la arquitectura y reparte el trabajo. Quedan 8 días de construcción. Roles: D = Diego (datos y servicios), M = Cristhian (ML y evaluación), B = Arturo (backend y agente), F = front y producto (Arturo y Diego); P = Andrés (plataforma, tabla de la sección 7.1). Reunión diaria de 15 minutos a las 9:00 y cierre a las 21:00 con demo interna de lo que funciona. Hitos: M1 (mar 29) flujo de punta a punta por API; M2 (jue 1) tres rutas completas en la interfaz; M3 (sáb 3) evaluación y despliegue congelados; M4 (dom 4) video y slides; entrega lun 5 antes del mediodía.</w:t>
       </w:r>
     </w:p>
     <w:tbl>
@@ -12636,12 +13419,12 @@
         <w:tblLook w:firstColumn="1" w:firstRow="1" w:lastColumn="0" w:lastRow="0" w:noHBand="0" w:noVBand="1" w:val="04A0"/>
       </w:tblPr>
       <w:tblGrid>
-        <w:gridCol w:w="1569"/>
-        <w:gridCol w:w="1569"/>
-        <w:gridCol w:w="1569"/>
-        <w:gridCol w:w="1569"/>
-        <w:gridCol w:w="1569"/>
-        <w:gridCol w:w="1569"/>
+        <w:gridCol w:w="1701"/>
+        <w:gridCol w:w="1701"/>
+        <w:gridCol w:w="1701"/>
+        <w:gridCol w:w="1701"/>
+        <w:gridCol w:w="1701"/>
+        <w:gridCol w:w="1701"/>
       </w:tblGrid>
       <w:tr>
         <w:tc>
@@ -12773,7 +13556,7 @@
               <w:rPr>
                 <w:sz w:val="15"/>
               </w:rPr>
-              <w:t>Sáb 26 sep</w:t>
+              <w:t>Dom 27 sep (noche)</w:t>
             </w:r>
           </w:p>
         </w:tc>
@@ -12790,7 +13573,7 @@
               <w:rPr>
                 <w:sz w:val="15"/>
               </w:rPr>
-              <w:t>Decisión y diseño</w:t>
+              <w:t>Reunión: validar arquitectura y repartir trabajo</w:t>
             </w:r>
           </w:p>
         </w:tc>
@@ -12807,7 +13590,7 @@
               <w:rPr>
                 <w:sz w:val="15"/>
               </w:rPr>
-              <w:t>Estructura del repo de la app; 6 clientes preparados (Lucía, Andrés, Martina, Carlos, João, Sofía) y generador de clientes sintéticos</w:t>
+              <w:t>Revisar el pipeline y las tablas gold que usará la demo</w:t>
             </w:r>
           </w:p>
         </w:tc>
@@ -12824,7 +13607,7 @@
               <w:rPr>
                 <w:sz w:val="15"/>
               </w:rPr>
-              <w:t>Taxonomía de intenciones y plantilla de etiquetado; guía de variantes por país</w:t>
+              <w:t>Revisar la taxonomía de intenciones (motivo, tipo de queja, urgencia) y la plantilla de etiquetado</w:t>
             </w:r>
           </w:p>
         </w:tc>
@@ -12841,7 +13624,7 @@
               <w:rPr>
                 <w:sz w:val="15"/>
               </w:rPr>
-              <w:t>Máquina de estados v1 con triaje de los 6 motivos; reglas de ruta/completitud en YAML; esquema del expediente y del paquete de derivación</w:t>
+              <w:t>Presentar arquitectura y flujo; cerrar decisiones (Bedrock o API directa, React o Streamlit)</w:t>
             </w:r>
           </w:p>
         </w:tc>
@@ -12858,7 +13641,7 @@
               <w:rPr>
                 <w:sz w:val="15"/>
               </w:rPr>
-              <w:t>Guion de las 6 conversaciones de la demo (3 casos × ES/PT); bocetos de las 4 pantallas</w:t>
+              <w:t>Acordar el guion de las 6 conversaciones de la demo (3 casos × ES/PT)</w:t>
             </w:r>
           </w:p>
         </w:tc>
@@ -12877,7 +13660,7 @@
               <w:rPr>
                 <w:sz w:val="15"/>
               </w:rPr>
-              <w:t>Dom 27 sep</w:t>
+              <w:t>Lun 28 sep</w:t>
             </w:r>
           </w:p>
         </w:tc>
@@ -12911,7 +13694,7 @@
               <w:rPr>
                 <w:sz w:val="15"/>
               </w:rPr>
-              <w:t>Servicio de casos (DynamoDB, con SQLite en local) con estados, SLA y reloj; gateway de herramientas sobre gold con verificación de propiedad</w:t>
+              <w:t>Estructura del repo de la app; copia de gold a S3; servicio de casos (DynamoDB, con SQLite en local) con estados y SLA; 6 clientes preparados y generador de clientes sintéticos</w:t>
             </w:r>
           </w:p>
         </w:tc>
@@ -12928,7 +13711,7 @@
               <w:rPr>
                 <w:sz w:val="15"/>
               </w:rPr>
-              <w:t>Primeras 300 frases ES/PT (generación + revisión); baseline de palabras clave</w:t>
+              <w:t>Primeras 300 frases ES/PT (generación con LLM externo para PT + revisión); baseline de palabras clave</w:t>
             </w:r>
           </w:p>
         </w:tc>
@@ -12945,7 +13728,7 @@
               <w:rPr>
                 <w:sz w:val="15"/>
               </w:rPr>
-              <w:t>Orquestador con plantillas automáticas; integración con Claude (prompt de sistema con caché, salida estructurada para entidades)</w:t>
+              <w:t>Máquina de estados v1 con triaje de los 6 motivos; reglas de ruta/completitud en YAML; esquema del expediente; orquestador con plantillas automáticas</w:t>
             </w:r>
           </w:p>
         </w:tc>
@@ -12962,7 +13745,7 @@
               <w:rPr>
                 <w:sz w:val="15"/>
               </w:rPr>
-              <w:t>Esqueleto del chat y del panel del expediente; selector ES/PT y de usuario de prueba</w:t>
+              <w:t>Bocetos de las 4 pantallas; esqueleto del chat y del panel del expediente</w:t>
             </w:r>
           </w:p>
         </w:tc>
@@ -12981,7 +13764,7 @@
               <w:rPr>
                 <w:sz w:val="15"/>
               </w:rPr>
-              <w:t>Lun 28 sep</w:t>
+              <w:t>Mar 29 sep</w:t>
             </w:r>
           </w:p>
         </w:tc>
@@ -12998,7 +13781,7 @@
               <w:rPr>
                 <w:sz w:val="15"/>
               </w:rPr>
-              <w:t>M1 · Punta a punta</w:t>
+              <w:t>M1 · Punta a punta por API</w:t>
             </w:r>
           </w:p>
         </w:tc>
@@ -13015,7 +13798,7 @@
               <w:rPr>
                 <w:sz w:val="15"/>
               </w:rPr>
-              <w:t>Trazas por conversación (tabla); despliegue de prueba en App Runner; alarma de presupuesto; copia de gold a S3</w:t>
+              <w:t>Gateway de herramientas sobre gold con verificación de propiedad; trazas por conversación</w:t>
             </w:r>
           </w:p>
         </w:tc>
@@ -13032,7 +13815,7 @@
               <w:rPr>
                 <w:sz w:val="15"/>
               </w:rPr>
-              <w:t>600 frases etiquetadas por dos personas; medición de acuerdo</w:t>
+              <w:t>600 frases etiquetadas por dos personas; medición de acuerdo; clasificador v1 (embeddings + regresión logística)</w:t>
             </w:r>
           </w:p>
         </w:tc>
@@ -13049,7 +13832,7 @@
               <w:rPr>
                 <w:sz w:val="15"/>
               </w:rPr>
-              <w:t>Ruta B completo por API: entender → verificar → abrir caso → número y fecha prometida</w:t>
+              <w:t>Integración con Claude (prompt de sistema con caché, salida estructurada para entidades); ruta B completa por API: entender → verificar → abrir caso → número y fecha</w:t>
             </w:r>
           </w:p>
         </w:tc>
@@ -13085,7 +13868,7 @@
               <w:rPr>
                 <w:sz w:val="15"/>
               </w:rPr>
-              <w:t>Mar 29 sep</w:t>
+              <w:t>Mié 30 sep</w:t>
             </w:r>
           </w:p>
         </w:tc>
@@ -13102,7 +13885,7 @@
               <w:rPr>
                 <w:sz w:val="15"/>
               </w:rPr>
-              <w:t>Ruta A</w:t>
+              <w:t>Rutas A y C</w:t>
             </w:r>
           </w:p>
         </w:tc>
@@ -13119,7 +13902,7 @@
               <w:rPr>
                 <w:sz w:val="15"/>
               </w:rPr>
-              <w:t>Tabla sintética de tarifas (etiquetada); búsqueda de transacciones por fecha local, monto aproximado y comercio</w:t>
+              <w:t>Tabla sintética de tarifas; búsqueda de transacciones por fecha local, monto aproximado y comercio; EventBridge → /tick con alertas 24 h, 80% SLA, vencimiento</w:t>
             </w:r>
           </w:p>
         </w:tc>
@@ -13136,7 +13919,7 @@
               <w:rPr>
                 <w:sz w:val="15"/>
               </w:rPr>
-              <w:t>Clasificador v1 (embeddings + regresión logística) vs baselines; primera compuerta de confianza</w:t>
+              <w:t>Compuerta de confianza calibrada; conjunto de 200 conversaciones de prueba con resultado esperado (incluye 30 adversarias)</w:t>
             </w:r>
           </w:p>
         </w:tc>
@@ -13153,7 +13936,7 @@
               <w:rPr>
                 <w:sz w:val="15"/>
               </w:rPr>
-              <w:t>Resoluciones del ruta A (cargo explicado, reverso aplicado, tarifa, error de app); pregunta '¿quedó resuelto?'</w:t>
+              <w:t>Resoluciones de la ruta A (cargo explicado, reverso, tarifa, error de app); reglas de derivación, paquete de derivación, enrutamiento por idioma y especialidad; defensa contra inyección</w:t>
             </w:r>
           </w:p>
         </w:tc>
@@ -13170,7 +13953,7 @@
               <w:rPr>
                 <w:sz w:val="15"/>
               </w:rPr>
-              <w:t>Botones de opciones, aclaraciones, mensajes de estado; primera versión en portugués</w:t>
+              <w:t>Botones de opciones, aclaraciones, mensajes de estado; primera versión en portugués; pantalla del agente (cola, expediente, tomar/resolver/devolver)</w:t>
             </w:r>
           </w:p>
         </w:tc>
@@ -13189,7 +13972,7 @@
               <w:rPr>
                 <w:sz w:val="15"/>
               </w:rPr>
-              <w:t>Mié 30 sep</w:t>
+              <w:t>Jue 1 oct</w:t>
             </w:r>
           </w:p>
         </w:tc>
@@ -13206,7 +13989,7 @@
               <w:rPr>
                 <w:sz w:val="15"/>
               </w:rPr>
-              <w:t>Ruta C y humano</w:t>
+              <w:t>M2 · Tres rutas en la interfaz</w:t>
             </w:r>
           </w:p>
         </w:tc>
@@ -13223,7 +14006,7 @@
               <w:rPr>
                 <w:sz w:val="15"/>
               </w:rPr>
-              <w:t>EventBridge Scheduler → /tick: alertas 24 h, 80% SLA, vencimiento; segunda opinión</w:t>
+              <w:t>Segunda opinión al cerrar; tablero del banco v1 (rutas, promesas en riesgo, latencia, costo)</w:t>
             </w:r>
           </w:p>
         </w:tc>
@@ -13240,7 +14023,7 @@
               <w:rPr>
                 <w:sz w:val="15"/>
               </w:rPr>
-              <w:t>Conjunto de 200 conversaciones de prueba con resultado esperado (incluye 30 adversarias)</w:t>
+              <w:t>Corrida completa de la suite; primer reporte de métricas por idioma y país</w:t>
             </w:r>
           </w:p>
         </w:tc>
@@ -13257,7 +14040,7 @@
               <w:rPr>
                 <w:sz w:val="15"/>
               </w:rPr>
-              <w:t>Reglas de derivación; paquete de derivación; enrutamiento por idioma y especialidad; defensa contra inyección</w:t>
+              <w:t>Modo degradado sin LLM; reintentos acotados; límites de sesión; corrección de fallos de la suite</w:t>
             </w:r>
           </w:p>
         </w:tc>
@@ -13274,7 +14057,7 @@
               <w:rPr>
                 <w:sz w:val="15"/>
               </w:rPr>
-              <w:t>Consola del agente: cola por ruta e idioma, expediente, tomar/resolver/devolver; interruptores de falla</w:t>
+              <w:t>Interruptores de falla; pulido de las 6 conversaciones de la demo; textos en PT revisados con el LLM externo</w:t>
             </w:r>
           </w:p>
         </w:tc>
@@ -13293,7 +14076,7 @@
               <w:rPr>
                 <w:sz w:val="15"/>
               </w:rPr>
-              <w:t>Jue 1 oct</w:t>
+              <w:t>Vie 2 oct</w:t>
             </w:r>
           </w:p>
         </w:tc>
@@ -13310,7 +14093,7 @@
               <w:rPr>
                 <w:sz w:val="15"/>
               </w:rPr>
-              <w:t>M2 · Tres rutas en la interfaz</w:t>
+              <w:t>Evaluación y decisión de modelo</w:t>
             </w:r>
           </w:p>
         </w:tc>
@@ -13327,7 +14110,7 @@
               <w:rPr>
                 <w:sz w:val="15"/>
               </w:rPr>
-              <w:t>Panel de operación v1: rutas, promesas en riesgo, latencia, costo</w:t>
+              <w:t>Fixture de actualización de datos (backup vs actual) y prueba automática; botón 'reiniciar demo'</w:t>
             </w:r>
           </w:p>
         </w:tc>
@@ -13344,7 +14127,7 @@
               <w:rPr>
                 <w:sz w:val="15"/>
               </w:rPr>
-              <w:t>Corrida completa de la suite; primer reporte de métricas por idioma y país</w:t>
+              <w:t>Comparación Opus 5 vs Sonnet 5 en la misma suite; juez LLM validado con 50 casos a mano; clasificador final con 3 semillas</w:t>
             </w:r>
           </w:p>
         </w:tc>
@@ -13361,7 +14144,7 @@
               <w:rPr>
                 <w:sz w:val="15"/>
               </w:rPr>
-              <w:t>Modo degradado sin LLM; reintentos acotados; límites de sesión; corrección de fallos de la suite</w:t>
+              <w:t>Ajustes de reglas y compuerta con los resultados; casos adversarios adicionales</w:t>
             </w:r>
           </w:p>
         </w:tc>
@@ -13378,7 +14161,7 @@
               <w:rPr>
                 <w:sz w:val="15"/>
               </w:rPr>
-              <w:t>Pulido de las 6 conversaciones de la demo; textos en PT generados y revisados con un LLM externo</w:t>
+              <w:t>Tablero con las métricas de evaluación; capturas para slides</w:t>
             </w:r>
           </w:p>
         </w:tc>
@@ -13397,7 +14180,7 @@
               <w:rPr>
                 <w:sz w:val="15"/>
               </w:rPr>
-              <w:t>Vie 2 oct</w:t>
+              <w:t>Sáb 3 oct</w:t>
             </w:r>
           </w:p>
         </w:tc>
@@ -13414,7 +14197,7 @@
               <w:rPr>
                 <w:sz w:val="15"/>
               </w:rPr>
-              <w:t>Evaluación y decisión de modelo</w:t>
+              <w:t>M3 · Congelar y desplegar</w:t>
             </w:r>
           </w:p>
         </w:tc>
@@ -13431,111 +14214,7 @@
               <w:rPr>
                 <w:sz w:val="15"/>
               </w:rPr>
-              <w:t>Fixture de actualización de datos (backup vs actual) y prueba automática</w:t>
-            </w:r>
-          </w:p>
-        </w:tc>
-        <w:tc>
-          <w:tcPr>
-            <w:tcW w:type="dxa" w:w="1757"/>
-          </w:tcPr>
-          <w:p>
-            <w:pPr>
-              <w:spacing w:after="20"/>
-            </w:pPr>
-            <w:r/>
-            <w:r>
-              <w:rPr>
-                <w:sz w:val="15"/>
-              </w:rPr>
-              <w:t>Comparación Opus 5 vs Sonnet 5 en la misma suite; juez LLM validado con 50 casos a mano; clasificador final con 3 semillas</w:t>
-            </w:r>
-          </w:p>
-        </w:tc>
-        <w:tc>
-          <w:tcPr>
-            <w:tcW w:type="dxa" w:w="1871"/>
-          </w:tcPr>
-          <w:p>
-            <w:pPr>
-              <w:spacing w:after="20"/>
-            </w:pPr>
-            <w:r/>
-            <w:r>
-              <w:rPr>
-                <w:sz w:val="15"/>
-              </w:rPr>
-              <w:t>Ajustes de reglas y compuerta con los resultados; casos adversarios adicionales</w:t>
-            </w:r>
-          </w:p>
-        </w:tc>
-        <w:tc>
-          <w:tcPr>
-            <w:tcW w:type="dxa" w:w="1701"/>
-          </w:tcPr>
-          <w:p>
-            <w:pPr>
-              <w:spacing w:after="20"/>
-            </w:pPr>
-            <w:r/>
-            <w:r>
-              <w:rPr>
-                <w:sz w:val="15"/>
-              </w:rPr>
-              <w:t>Panel de operación con las métricas de evaluación; captura de pantallas para slides</w:t>
-            </w:r>
-          </w:p>
-        </w:tc>
-      </w:tr>
-      <w:tr>
-        <w:tc>
-          <w:tcPr>
-            <w:tcW w:type="dxa" w:w="964"/>
-          </w:tcPr>
-          <w:p>
-            <w:pPr>
-              <w:spacing w:after="20"/>
-            </w:pPr>
-            <w:r/>
-            <w:r>
-              <w:rPr>
-                <w:sz w:val="15"/>
-              </w:rPr>
-              <w:t>Sáb 3 oct</w:t>
-            </w:r>
-          </w:p>
-        </w:tc>
-        <w:tc>
-          <w:tcPr>
-            <w:tcW w:type="dxa" w:w="1191"/>
-          </w:tcPr>
-          <w:p>
-            <w:pPr>
-              <w:spacing w:after="20"/>
-            </w:pPr>
-            <w:r/>
-            <w:r>
-              <w:rPr>
-                <w:sz w:val="15"/>
-              </w:rPr>
-              <w:t>M3 · Congelar y desplegar</w:t>
-            </w:r>
-          </w:p>
-        </w:tc>
-        <w:tc>
-          <w:tcPr>
-            <w:tcW w:type="dxa" w:w="1871"/>
-          </w:tcPr>
-          <w:p>
-            <w:pPr>
-              <w:spacing w:after="20"/>
-            </w:pPr>
-            <w:r/>
-            <w:r>
-              <w:rPr>
-                <w:sz w:val="15"/>
-              </w:rPr>
-              <w:t>Despliegue final en App Runner; README con guía de prueba paso a paso y clientes sintéticos; verificación desde otra red</w:t>
+              <w:t>Despliegue final; README con guía de prueba paso a paso y clientes sintéticos; verificación desde otra red</w:t>
             </w:r>
           </w:p>
         </w:tc>
@@ -13823,7 +14502,7 @@
           <w:i/>
           <w:sz w:val="19"/>
         </w:rPr>
-        <w:t>Si el día 30 el ruta C no está listo, se recorta el panel de operación (día 1) y no la evaluación. La evaluación y el README pesan más en el puntaje que una pantalla adicional.</w:t>
+        <w:t>Si el jueves 1 la ruta C no está lista, se recorta el tablero del banco y el módulo de notificaciones, nunca la evaluación ni el README: pesan más en el puntaje que una pantalla adicional. Si el miércoles 30 el front en React no funciona, se pasa a Streamlit ese mismo día.</w:t>
       </w:r>
     </w:p>
     <w:p>
@@ -13856,9 +14535,9 @@
         <w:tblLook w:firstColumn="1" w:firstRow="1" w:lastColumn="0" w:lastRow="0" w:noHBand="0" w:noVBand="1" w:val="04A0"/>
       </w:tblPr>
       <w:tblGrid>
-        <w:gridCol w:w="3137"/>
-        <w:gridCol w:w="3137"/>
-        <w:gridCol w:w="3137"/>
+        <w:gridCol w:w="3402"/>
+        <w:gridCol w:w="3402"/>
+        <w:gridCol w:w="3402"/>
       </w:tblGrid>
       <w:tr>
         <w:tc>
@@ -14388,10 +15067,10 @@
         <w:tblLook w:firstColumn="1" w:firstRow="1" w:lastColumn="0" w:lastRow="0" w:noHBand="0" w:noVBand="1" w:val="04A0"/>
       </w:tblPr>
       <w:tblGrid>
-        <w:gridCol w:w="2353"/>
-        <w:gridCol w:w="2353"/>
-        <w:gridCol w:w="2353"/>
-        <w:gridCol w:w="2353"/>
+        <w:gridCol w:w="2551"/>
+        <w:gridCol w:w="2551"/>
+        <w:gridCol w:w="2551"/>
+        <w:gridCol w:w="2551"/>
       </w:tblGrid>
       <w:tr>
         <w:tc>
@@ -15413,9 +16092,9 @@
         <w:tblLook w:firstColumn="1" w:firstRow="1" w:lastColumn="0" w:lastRow="0" w:noHBand="0" w:noVBand="1" w:val="04A0"/>
       </w:tblPr>
       <w:tblGrid>
-        <w:gridCol w:w="3137"/>
-        <w:gridCol w:w="3137"/>
-        <w:gridCol w:w="3137"/>
+        <w:gridCol w:w="3402"/>
+        <w:gridCol w:w="3402"/>
+        <w:gridCol w:w="3402"/>
       </w:tblGrid>
       <w:tr>
         <w:tc>
@@ -15662,10 +16341,10 @@
         <w:tblLook w:firstColumn="1" w:firstRow="1" w:lastColumn="0" w:lastRow="0" w:noHBand="0" w:noVBand="1" w:val="04A0"/>
       </w:tblPr>
       <w:tblGrid>
-        <w:gridCol w:w="2353"/>
-        <w:gridCol w:w="2353"/>
-        <w:gridCol w:w="2353"/>
-        <w:gridCol w:w="2353"/>
+        <w:gridCol w:w="2551"/>
+        <w:gridCol w:w="2551"/>
+        <w:gridCol w:w="2551"/>
+        <w:gridCol w:w="2551"/>
       </w:tblGrid>
       <w:tr>
         <w:tc>
@@ -16195,9 +16874,9 @@
         <w:tblLook w:firstColumn="1" w:firstRow="1" w:lastColumn="0" w:lastRow="0" w:noHBand="0" w:noVBand="1" w:val="04A0"/>
       </w:tblPr>
       <w:tblGrid>
-        <w:gridCol w:w="3137"/>
-        <w:gridCol w:w="3137"/>
-        <w:gridCol w:w="3137"/>
+        <w:gridCol w:w="3402"/>
+        <w:gridCol w:w="3402"/>
+        <w:gridCol w:w="3402"/>
       </w:tblGrid>
       <w:tr>
         <w:tc>
@@ -16848,9 +17527,8 @@
       </w:r>
     </w:p>
     <w:sectPr>
-      <w:footerReference w:type="default" r:id="rId9"/>
       <w:pgSz w:w="11906" w:h="16838"/>
-      <w:pgMar w:top="1134" w:right="1247" w:bottom="1134" w:left="1247" w:header="720" w:footer="720" w:gutter="0"/>
+      <w:pgMar w:top="850" w:right="850" w:bottom="850" w:left="850" w:header="720" w:footer="720" w:gutter="0"/>
       <w:cols w:space="720"/>
       <w:docGrid w:linePitch="360"/>
     </w:sectPr>

</xml_diff>